<commit_message>
docs+chore: memoria no sobreclama el cron de ML_10, ticket 105 para desplegarlo
Auditando mas alla de VIKT_*: verificado en esta EC2 que el cron.d del
reentrenamiento nocturno (ML_10) nunca se instalo (/etc/cron.d/ sin el,
sin crontab de ubuntu) -- su propio doc/ML-10 ya lo admitia como "paso de
despliegue pendiente", pero mi redaccion de VIKT_02 en S5.4/5.5 lo
describia como si ya estuviera programado en produccion. Corregido a
"disenado y verificado a mano, programacion pendiente de desplegar", con
una nota explicita anadida a S7.4 junto al backtest incremental.

Filed como ticket 105 (no desplegado directamente -- un cron con
credenciales AWS recurrente y sin supervision necesita aprobacion
explicita, mismo criterio que un terraform apply).

PLAN.md actualizado: proximo numero libre 106.
</commit_message>
<xml_diff>
--- a/documents/Memoria_TFM FV.docx
+++ b/documents/Memoria_TFM FV.docx
@@ -3404,7 +3404,7 @@
         <w:jc w:val="both"/>
       </w:pPr>
       <w:r>
-        <w:t>Una de las premisas del proyecto es el coste cero en datos y software. Todas las fuentes son datos abiertos públicos y toda la pila tecnológica se apoya en servicios gestionados de AWS dentro de su nivel gratuito (Lambda, EventBridge Scheduler, Glue, Athena, S3) y en Neo4j AuraDB Free; el proyecto no requiere coste material en su núcleo. Tampoco lo añade el pipeline de modelado: MLflow usa un backend SQLite local (sin servidor), el reentrenamiento nocturno se programa con `cron` en la misma instancia (sin recursos nuevos de AWS) y la inferencia ONNX corre sobre CPU. El único gasto real observado en desarrollo proviene de las ejecuciones de AWS Glue fuera del nivel gratuito, vigilado con una herramienta de estimación y desglose de coste construida para el proyecto (`herramientas/costes/`).</w:t>
+        <w:t>Una de las premisas del proyecto es el coste cero en datos y software. Todas las fuentes son datos abiertos públicos y toda la pila tecnológica se apoya en servicios gestionados de AWS dentro de su nivel gratuito (Lambda, EventBridge Scheduler, Glue, Athena, S3) y en Neo4j AuraDB Free; el proyecto no requiere coste material en su núcleo. Tampoco lo añade el pipeline de modelado: MLflow usa un backend SQLite local (sin servidor), el reentrenamiento nocturno está diseñado para programarse con `cron` en la misma instancia (sin recursos nuevos de AWS) y la inferencia ONNX corre sobre CPU. El único gasto real observado en desarrollo proviene de las ejecuciones de AWS Glue fuera del nivel gratuito, vigilado con una herramienta de estimación y desglose de coste construida para el proyecto (`herramientas/costes/`).</w:t>
       </w:r>
     </w:p>
     <w:tbl>
@@ -3854,7 +3854,7 @@
     <w:p>
       <w:pPr/>
       <w:r>
-        <w:t>Los forecasters de árbol (LightGBM) se exportan a ONNX para una ejecución portable: el modelo servido reproduce al nativo con un error medio de en torno al 0,1 % de la escala del target, dentro de la tolerancia definida en `modelado/export/CONTRATO.md`, que fija también el orden, tipo y unidad de cada feature de entrada. El modelo de grafo (STGNN) no exporta a ONNX por una limitación conocida de `torch.export` con su bucle temporal; mientras tanto se sirve directamente desde su registro nativo (véase 7.4 y 7.5). El despliegue de la infraestructura se gestiona íntegramente como código con Terraform; el reentrenamiento del modelo se programa por separado, una vez al día, con una tarea `cron` en la propia instancia —sin crear infraestructura nueva—, que reconstruye el panel de datos, reentrena, evalúa contra el modelo vigente y solo promueve la nueva versión si no empeora.</w:t>
+        <w:t>Los forecasters de árbol (LightGBM) se exportan a ONNX para una ejecución portable: el modelo servido reproduce al nativo con un error medio de en torno al 0,1 % de la escala del target, dentro de la tolerancia definida en `modelado/export/CONTRATO.md`, que fija también el orden, tipo y unidad de cada feature de entrada. El modelo de grafo (STGNN) no exporta a ONNX por una limitación conocida de `torch.export` con su bucle temporal; mientras tanto se sirve directamente desde su registro nativo (véase 7.4 y 7.5). El despliegue de la infraestructura se gestiona íntegramente como código con Terraform; el reentrenamiento del modelo se ha verificado manualmente y se ejecuta por separado del resto del pipeline, mediante una tarea `cron` en la propia instancia —sin crear infraestructura nueva—, que reconstruye el panel de datos, reentrena, evalúa contra el modelo vigente y solo promueve la nueva versión si no empeora; su programación periódica en producción es el último paso de despliegue pendiente (véase 7.4).</w:t>
       </w:r>
     </w:p>
     <w:p>
@@ -5185,7 +5185,7 @@
         <w:jc w:val="both"/>
       </w:pPr>
       <w:r>
-        <w:t>El backtest incremental (entrenamientos sucesivos con más días de historia) muestra la mejora esperada pero con varianza alta: el skill a 6 h de calidad del aire sube de ~0,63 (22/8) a ~0,80 (27/8), con un bache real a 0,11 el 25/8 (dos días peores en los propios datos, no un artefacto) — evidencia directa de que el modelo aún no ha convergido con esta ventana de datos.</w:t>
+        <w:t>El backtest incremental (entrenamientos sucesivos con más días de historia) muestra la mejora esperada pero con varianza alta: el skill a 6 h de calidad del aire sube de ~0,63 (22/8) a ~0,80 (27/8), con un bache real a 0,11 el 25/8 (dos días peores en los propios datos, no un artefacto) — evidencia directa de que el modelo aún no ha convergido con esta ventana de datos. El mecanismo de reentrenamiento nocturno que alimentaría esa curva en producción está construido y verificado manualmente, pero su programación periódica (una tarea `cron` en la instancia) todavía no está desplegada — es el último paso pendiente antes de que el modelo se mantenga fresco sin intervención manual.</w:t>
       </w:r>
     </w:p>
     <w:p>

</xml_diff>